<commit_message>
cô giáo thông báo không thi nên không viết nữa
</commit_message>
<xml_diff>
--- a/Ôn thi/3-Cây quyết định C4.5/1-Mã giả thuật toán C4.5.docx
+++ b/Ôn thi/3-Cây quyết định C4.5/1-Mã giả thuật toán C4.5.docx
@@ -196,6 +196,15 @@
         <w:ind w:firstLine="720"/>
       </w:pPr>
       <w:r>
+        <w:tab/>
+        <w:t>return;</w:t>
+      </w:r>
+    </w:p>
+    <w:p>
+      <w:pPr>
+        <w:ind w:firstLine="720"/>
+      </w:pPr>
+      <w:r>
         <w:t>}</w:t>
       </w:r>
     </w:p>
@@ -214,13 +223,7 @@
         <w:ind w:left="360" w:firstLine="360"/>
       </w:pPr>
       <w:r>
-        <w:t>if(</w:t>
-      </w:r>
-      <w:r>
-        <w:t xml:space="preserve"> tapThuocTinh == rỗng </w:t>
-      </w:r>
-      <w:r>
-        <w:t>){</w:t>
+        <w:t>if( tapThuocTinh == rỗng ){</w:t>
       </w:r>
     </w:p>
     <w:p>
@@ -261,6 +264,15 @@
       </w:r>
       <w:r>
         <w:t>(nhan1);</w:t>
+      </w:r>
+    </w:p>
+    <w:p>
+      <w:pPr>
+        <w:ind w:firstLine="720"/>
+      </w:pPr>
+      <w:r>
+        <w:tab/>
+        <w:t>return;</w:t>
       </w:r>
     </w:p>
     <w:p>
@@ -446,10 +458,7 @@
         <w:ind w:left="360" w:firstLine="360"/>
       </w:pPr>
       <w:r>
-        <w:t>tenCotDuocChon</w:t>
-      </w:r>
-      <w:r>
-        <w:t xml:space="preserve"> = tenCot[i]</w:t>
+        <w:t>tenCotDuocChon = tenCot[i]</w:t>
       </w:r>
     </w:p>
     <w:p/>
@@ -509,10 +518,7 @@
         <w:ind w:left="720" w:firstLine="720"/>
       </w:pPr>
       <w:r>
-        <w:t>tapDuLieu_tenCotDuocChon_value1</w:t>
-      </w:r>
-      <w:r>
-        <w:t xml:space="preserve"> </w:t>
+        <w:t xml:space="preserve">tapDuLieu_tenCotDuocChon_value1 </w:t>
       </w:r>
       <w:r>
         <w:t>= null;</w:t>
@@ -586,6 +592,7 @@
         <w:ind w:left="1440" w:firstLine="720"/>
       </w:pPr>
       <w:r>
+        <w:lastRenderedPageBreak/>
         <w:t>}</w:t>
       </w:r>
     </w:p>
@@ -607,10 +614,7 @@
         <w:ind w:left="1080" w:firstLine="360"/>
       </w:pPr>
       <w:r>
-        <w:t xml:space="preserve">Viết lại bảng : </w:t>
-      </w:r>
-      <w:r>
-        <w:t>tapDuLieu_tenCotDuocChon_value1</w:t>
+        <w:t>Viết lại bảng : tapDuLieu_tenCotDuocChon_value1</w:t>
       </w:r>
     </w:p>
     <w:p>
@@ -750,7 +754,6 @@
         <w:ind w:left="720" w:firstLine="720"/>
       </w:pPr>
       <w:r>
-        <w:lastRenderedPageBreak/>
         <w:tab/>
         <w:t xml:space="preserve">tapThuocTinh_tenCotDuocChon_value1 </w:t>
       </w:r>
@@ -837,10 +840,7 @@
         <w:ind w:left="3600"/>
       </w:pPr>
       <w:r>
-        <w:t>tapDuLieu_tenCotDuocChon_value1</w:t>
-      </w:r>
-      <w:r>
-        <w:t xml:space="preserve">, </w:t>
+        <w:t xml:space="preserve">tapDuLieu_tenCotDuocChon_value1, </w:t>
       </w:r>
       <w:r>
         <w:t>tapThuocTinh_tenCotDuocChon_value1</w:t>
@@ -855,6 +855,18 @@
       </w:r>
       <w:r>
         <w:t>;</w:t>
+      </w:r>
+    </w:p>
+    <w:p>
+      <w:r>
+        <w:tab/>
+      </w:r>
+      <w:r>
+        <w:tab/>
+      </w:r>
+      <w:r>
+        <w:tab/>
+        <w:t>return;</w:t>
       </w:r>
     </w:p>
     <w:p>

</xml_diff>